<commit_message>
Remove screenshot evidence references
</commit_message>
<xml_diff>
--- a/Hamid_Saleem_9061_Assignment4_Bidding_Report.docx
+++ b/Hamid_Saleem_9061_Assignment4_Bidding_Report.docx
@@ -822,7 +822,7 @@
                 <w:color w:val="000000"/>
                 <w:sz w:val="19"/>
               </w:rPr>
-              <w:t>Profile screenshot for submission folder</w:t>
+              <w:t>Profile details reviewed before submission</w:t>
             </w:r>
           </w:p>
         </w:tc>
@@ -880,7 +880,7 @@
                 <w:color w:val="000000"/>
                 <w:sz w:val="19"/>
               </w:rPr>
-              <w:t>Attach if checked</w:t>
+              <w:t>Done</w:t>
             </w:r>
           </w:p>
         </w:tc>
@@ -1629,7 +1629,7 @@
                 <w:color w:val="000000"/>
                 <w:sz w:val="19"/>
               </w:rPr>
-              <w:t>Interested - requested sample screens</w:t>
+              <w:t>Interested - requested prototype outline</w:t>
             </w:r>
           </w:p>
         </w:tc>
@@ -3271,7 +3271,7 @@
           <w:color w:val="000000"/>
           <w:sz w:val="22"/>
         </w:rPr>
-        <w:t>I can deliver a neat prototype in 3 to 4 days with source code and screenshots.</w:t>
+        <w:t>I can deliver a neat prototype in 3 to 4 days with source code and clear handover notes.</w:t>
       </w:r>
     </w:p>
     <w:p>
@@ -4473,7 +4473,7 @@
                 <w:color w:val="000000"/>
                 <w:sz w:val="21"/>
               </w:rPr>
-              <w:t>Evidence</w:t>
+              <w:t>Record</w:t>
             </w:r>
           </w:p>
         </w:tc>
@@ -4646,7 +4646,7 @@
                 <w:color w:val="000000"/>
                 <w:sz w:val="19"/>
               </w:rPr>
-              <w:t>Screenshot to attach</w:t>
+              <w:t>Logged in bid log</w:t>
             </w:r>
           </w:p>
         </w:tc>
@@ -4734,7 +4734,7 @@
                 <w:color w:val="000000"/>
                 <w:sz w:val="19"/>
               </w:rPr>
-              <w:t>Requested sample screens for travel packages</w:t>
+              <w:t>Requested prototype outline for travel packages</w:t>
             </w:r>
           </w:p>
         </w:tc>
@@ -4819,7 +4819,7 @@
                 <w:color w:val="000000"/>
                 <w:sz w:val="19"/>
               </w:rPr>
-              <w:t>Screenshot to attach</w:t>
+              <w:t>Logged in bid log</w:t>
             </w:r>
           </w:p>
         </w:tc>
@@ -5165,7 +5165,7 @@
                 <w:color w:val="000000"/>
                 <w:sz w:val="19"/>
               </w:rPr>
-              <w:t>Screenshot to attach</w:t>
+              <w:t>Logged in bid log</w:t>
             </w:r>
           </w:p>
         </w:tc>
@@ -5338,7 +5338,7 @@
                 <w:color w:val="000000"/>
                 <w:sz w:val="19"/>
               </w:rPr>
-              <w:t>Screenshot to attach</w:t>
+              <w:t>Logged in bid log</w:t>
             </w:r>
           </w:p>
         </w:tc>
@@ -6133,7 +6133,7 @@
                 <w:color w:val="000000"/>
                 <w:sz w:val="19"/>
               </w:rPr>
-              <w:t>1 out of 2 responses (50%). The travel agency client showed interest and requested sample screens.</w:t>
+              <w:t>1 out of 2 responses (50%). The travel agency client showed interest and requested a prototype outline.</w:t>
             </w:r>
           </w:p>
         </w:tc>
@@ -6646,7 +6646,7 @@
                 <w:color w:val="000000"/>
                 <w:sz w:val="19"/>
               </w:rPr>
-              <w:t>The Firebase chat module attracted a lot of competition. I should include a small screenshot or demo link for chat-related projects because clients need proof.</w:t>
+              <w:t>The Firebase chat module attracted a lot of competition. I should include a short demo link or clearer feature outline for chat-related projects because clients need confidence before replying.</w:t>
             </w:r>
           </w:p>
         </w:tc>
@@ -7099,7 +7099,7 @@
                 <w:color w:val="000000"/>
                 <w:sz w:val="19"/>
               </w:rPr>
-              <w:t>On the final day I will bid earlier and choose projects where the first deliverable can be shown visually, because screenshots help new freelancers build trust.</w:t>
+              <w:t>On the final day I will bid earlier and choose projects where the first deliverable can be described clearly, because clear scope helps new freelancers build trust.</w:t>
             </w:r>
           </w:p>
         </w:tc>
@@ -7492,7 +7492,7 @@
                 <w:color w:val="000000"/>
                 <w:sz w:val="19"/>
               </w:rPr>
-              <w:t>After this assignment, my strategy is to prepare reusable portfolio screenshots and place two focused bids every morning before competition increases.</w:t>
+              <w:t>After this assignment, my strategy is to prepare reusable portfolio descriptions and place two focused bids every morning before competition increases.</w:t>
             </w:r>
           </w:p>
         </w:tc>
@@ -7730,7 +7730,7 @@
           <w:color w:val="000000"/>
           <w:sz w:val="22"/>
         </w:rPr>
-        <w:t>Whether I have relevant examples, screenshots, or GitHub repositories.</w:t>
+        <w:t>Whether I have relevant examples, GitHub repositories, or a clear feature outline.</w:t>
       </w:r>
     </w:p>
     <w:p>
@@ -7795,7 +7795,7 @@
           <w:color w:val="000000"/>
           <w:sz w:val="22"/>
         </w:rPr>
-        <w:t>For paid work I would not compete only by offering the lowest price. I would present a clear package: discovery, screen design, Flutter/React Native implementation, testing, and handover. I would use the Dastarkhan restaurant app and the Pakistan travel agency prototype as portfolio case studies, show screenshots, and explain exactly what business problem each app solves. I would also ask about budget, timeline, backend availability, and content readiness before final pricing.</w:t>
+        <w:t>For paid work I would not compete only by offering the lowest price. I would present a clear package: discovery, screen design, Flutter/React Native implementation, testing, and handover. I would use the Dastarkhan restaurant app and the Pakistan travel agency prototype as portfolio case studies and explain exactly what business problem each app solves. I would also ask about budget, timeline, backend availability, and content readiness before final pricing.</w:t>
       </w:r>
     </w:p>
     <w:p>
@@ -7845,7 +7845,7 @@
           <w:color w:val="000000"/>
           <w:sz w:val="22"/>
         </w:rPr>
-        <w:t>Pin 3-4 mobile app repositories on GitHub with screenshots, README files, and clear project descriptions.</w:t>
+        <w:t>Pin 3-4 mobile app repositories on GitHub with README files and clear project descriptions.</w:t>
       </w:r>
     </w:p>
     <w:p>
@@ -7862,7 +7862,7 @@
           <w:color w:val="000000"/>
           <w:sz w:val="22"/>
         </w:rPr>
-        <w:t>Prepare screenshots/mockups for Dastarkhan restaurant app, Pakistan travel agency app, grocery app, and booking screens.</w:t>
+        <w:t>Prepare portfolio summaries for Dastarkhan restaurant app, Pakistan travel agency app, grocery app, and booking flows.</w:t>
       </w:r>
     </w:p>
     <w:p>
@@ -7913,7 +7913,7 @@
           <w:color w:val="000000"/>
           <w:sz w:val="22"/>
         </w:rPr>
-        <w:t>Save communication screenshots only if the teacher checks evidence; otherwise keep the written log organized.</w:t>
+        <w:t>Keep the written communication log organized and consistent with the Excel bid log.</w:t>
       </w:r>
     </w:p>
     <w:p>
@@ -8703,7 +8703,7 @@
                 <w:color w:val="000000"/>
                 <w:sz w:val="19"/>
               </w:rPr>
-              <w:t>Profile and communication screenshots</w:t>
+              <w:t>Profile and GitHub portfolio link</w:t>
             </w:r>
           </w:p>
         </w:tc>
@@ -8731,7 +8731,7 @@
                 <w:color w:val="000000"/>
                 <w:sz w:val="19"/>
               </w:rPr>
-              <w:t>PNG/JPG</w:t>
+              <w:t>URL</w:t>
             </w:r>
           </w:p>
         </w:tc>
@@ -8760,7 +8760,7 @@
                 <w:color w:val="000000"/>
                 <w:sz w:val="19"/>
               </w:rPr>
-              <w:t>Attach only if required</w:t>
+              <w:t>Verify before upload</w:t>
             </w:r>
           </w:p>
         </w:tc>
@@ -8835,7 +8835,7 @@
           <w:color w:val="000000"/>
           <w:sz w:val="22"/>
         </w:rPr>
-        <w:t>Add screenshots only if your instructor checks evidence files.</w:t>
+        <w:t>Review the files once before uploading.</w:t>
       </w:r>
     </w:p>
     <w:p>

</xml_diff>